<commit_message>
sd-vlncn-sct-vn 2026.9.21.1: anti-error 35 (h)(i), ref 07 muc O Bac Ha, khung Phieu trinh cap lai
</commit_message>
<xml_diff>
--- a/sd-vlncn-sct-vn/skills/sd-vlncn-sct-vn/vi-du-thuc-te/Phieu-trinh-PGD-ky-GP-cap-lai-Duy-Cuong-ban-chot-21.9.2026.docx
+++ b/sd-vlncn-sct-vn/skills/sd-vlncn-sct-vn/vi-du-thuc-te/Phieu-trinh-PGD-ky-GP-cap-lai-Duy-Cuong-ban-chot-21.9.2026.docx
@@ -878,7 +878,7 @@
           <w:b/>
           <w:bCs/>
         </w:rPr>
-        <w:t>II. Ý KIẾN CỦA TRƯỞNG PHÒNG QUẢN LÝ CÔNG NGHIỆP</w:t>
+        <w:t>II. Ý KIẾN CỦA PHÒNG QUẢN LÝ CÔNG NGHIỆP</w:t>
       </w:r>
     </w:p>
     <w:p>
@@ -974,7 +974,7 @@
                 <w:bCs/>
                 <w:sz w:val="26"/>
               </w:rPr>
-              <w:t>TRƯỞNG PHÒNG</w:t>
+              <w:t>PHÓ TRƯỞNG PHÒNG</w:t>
             </w:r>
           </w:p>
           <w:p>
@@ -1014,7 +1014,7 @@
                 <w:b/>
                 <w:bCs/>
               </w:rPr>
-              <w:t>Nguyễn Hữu Long</w:t>
+              <w:t>Trần Trọng Trang</w:t>
             </w:r>
           </w:p>
           <w:p>

</xml_diff>